<commit_message>
Completa qualificação de Thaiane e atualiza PDF único
Co-Authored-By: Claude Opus 5.5 <noreply@anthropic.com>
Claude-Session: https://claude.ai/code/session_01VpzYZjXHFn3QHNVisLQJ7B
</commit_message>
<xml_diff>
--- a/Thaiane Silva Araújo/Declaração de hipossuficiência - Thaiane Silva Araújo.docx
+++ b/Thaiane Silva Araújo/Declaração de hipossuficiência - Thaiane Silva Araújo.docx
@@ -29,34 +29,7 @@
         <w:t xml:space="preserve">THAIANE SILVA ARAÚJO</w:t>
       </w:r>
       <w:r>
-        <w:t xml:space="preserve">, brasileira, </w:t>
-      </w:r>
-      <w:r>
-        <w:rPr>
-          <w:shd w:fill="FFF200" w:color="auto" w:val="clear"/>
-        </w:rPr>
-        <w:t xml:space="preserve">[estado civil]</w:t>
-      </w:r>
-      <w:r>
-        <w:t xml:space="preserve">, </w:t>
-      </w:r>
-      <w:r>
-        <w:rPr>
-          <w:shd w:fill="FFF200" w:color="auto" w:val="clear"/>
-        </w:rPr>
-        <w:t xml:space="preserve">[profissão]</w:t>
-      </w:r>
-      <w:r>
-        <w:t xml:space="preserve">, natural de Camocim/CE, nascida em 25/09/2007, filha de Sheila do Nascimento Silva e de Tardele Ferreira de Araújo, portadora do RG nº 8.487.505 SSP/PI, inscrita no CPF sob o nº 128.303.113-29, residente e domiciliada na Rua Curitiba, nº 315, Bairro </w:t>
-      </w:r>
-      <w:r>
-        <w:rPr>
-          <w:shd w:fill="FFF200" w:color="auto" w:val="clear"/>
-        </w:rPr>
-        <w:t xml:space="preserve">[bairro]</w:t>
-      </w:r>
-      <w:r>
-        <w:t xml:space="preserve">, Camocim/CE, CEP 62.400-000</w:t>
+        <w:t xml:space="preserve">, brasileira, solteira, do lar, natural de Camocim/CE, nascida em 25/09/2007, filha de Sheila do Nascimento Silva e de Tardele Ferreira de Araújo, portadora do RG nº 8.487.505 SSP/PI, inscrita no CPF sob o nº 128.303.113-29, residente e domiciliada na Rua Curitiba, nº 315, Centro, Camocim/CE, CEP 62.400-000</w:t>
       </w:r>
       <w:r>
         <w:t xml:space="preserve">, </w:t>

</xml_diff>